<commit_message>
Use Microsoft barcode image provider for the Voucher Cloud QR reports (#10289)
</commit_message>
<xml_diff>
--- a/Application/src/_Reports/layouts/NpRv VoucherCloudQR.docx
+++ b/Application/src/_Reports/layouts/NpRv VoucherCloudQR.docx
@@ -1100,10 +1100,18 @@
                                     <w:lang w:val="sr-Latn-RS"/>
                                   </w:rPr>
                                   <w:drawing>
-                                    <wp:inline distT="0" distB="0" distL="0" distR="0" wp14:anchorId="024059BE" wp14:editId="79BF8072">
+                                    <wp:anchor distT="0" distB="0" distL="114300" distR="114300" simplePos="0" relativeHeight="251662336" behindDoc="0" locked="0" layoutInCell="1" allowOverlap="1" wp14:anchorId="024059BE" wp14:editId="79BF8072">
+                                      <wp:simplePos x="0" y="0"/>
+                                      <wp:positionH relativeFrom="column">
+                                        <wp:align>center</wp:align>
+                                      </wp:positionH>
+                                      <wp:positionV relativeFrom="paragraph">
+                                        <wp:posOffset>0</wp:posOffset>
+                                      </wp:positionV>
                                       <wp:extent cx="603504" cy="603504"/>
-                                      <wp:effectExtent l="0" t="0" r="6350" b="6350"/>
-                                      <wp:docPr id="1" name="Picture 1" descr="A white square with a blue border&#10;&#10;Description automatically generated"/>
+                                      <wp:effectExtent l="0" t="0" r="0" b="0"/>
+                                      <wp:wrapNone/>
+                                      <wp:docPr id="9001" name="QR Code 1"/>
                                       <wp:cNvGraphicFramePr>
                                         <a:graphicFrameLocks xmlns:a="http://schemas.openxmlformats.org/drawingml/2006/main" noChangeAspect="1"/>
                                       </wp:cNvGraphicFramePr>
@@ -1145,7 +1153,7 @@
                                           </pic:pic>
                                         </a:graphicData>
                                       </a:graphic>
-                                    </wp:inline>
+                                    </wp:anchor>
                                   </w:drawing>
                                 </w:r>
                               </w:p>
@@ -1538,10 +1546,18 @@
                               <w:lang w:val="sr-Latn-RS"/>
                             </w:rPr>
                             <w:drawing>
-                              <wp:inline distT="0" distB="0" distL="0" distR="0" wp14:anchorId="024059BE" wp14:editId="79BF8072">
+                              <wp:anchor distT="0" distB="0" distL="114300" distR="114300" simplePos="0" relativeHeight="251663360" behindDoc="0" locked="0" layoutInCell="1" allowOverlap="1" wp14:anchorId="024059BF" wp14:editId="79BF8073">
+                                <wp:simplePos x="0" y="0"/>
+                                <wp:positionH relativeFrom="column">
+                                  <wp:align>center</wp:align>
+                                </wp:positionH>
+                                <wp:positionV relativeFrom="paragraph">
+                                  <wp:posOffset>0</wp:posOffset>
+                                </wp:positionV>
                                 <wp:extent cx="603504" cy="603504"/>
-                                <wp:effectExtent l="0" t="0" r="6350" b="6350"/>
-                                <wp:docPr id="1" name="Picture 1" descr="A white square with a blue border&#10;&#10;Description automatically generated"/>
+                                <wp:effectExtent l="0" t="0" r="0" b="0"/>
+                                <wp:wrapNone/>
+                                <wp:docPr id="9002" name="QR Code 2"/>
                                 <wp:cNvGraphicFramePr>
                                   <a:graphicFrameLocks xmlns:a="http://schemas.openxmlformats.org/drawingml/2006/main" noChangeAspect="1"/>
                                 </wp:cNvGraphicFramePr>
@@ -1583,7 +1599,7 @@
                                     </pic:pic>
                                   </a:graphicData>
                                 </a:graphic>
-                              </wp:inline>
+                              </wp:anchor>
                             </w:drawing>
                           </w:r>
                         </w:p>

</xml_diff>